<commit_message>
Etude-EBIOS-RM.docx: flag upfront how much of the document is original work vs. the ANSSI guide, and point to CREDITS.md
</commit_message>
<xml_diff>
--- a/reports/Etude-EBIOS-RM.docx
+++ b/reports/Etude-EBIOS-RM.docx
@@ -157,6 +157,60 @@
         </w:rPr>
         <w:t xml:space="preserve">  [Hypothèse] à discuter</w:t>
       </w:r>
+    </w:p>
+    <w:tbl>
+      <w:tblPr>
+        <w:tblW w:type="auto" w:w="0"/>
+        <w:jc w:val="center"/>
+        <w:tblLook w:firstColumn="1" w:firstRow="1" w:lastColumn="0" w:lastRow="0" w:noHBand="0" w:noVBand="1" w:val="04A0"/>
+      </w:tblPr>
+      <w:tblGrid>
+        <w:gridCol w:w="9632"/>
+      </w:tblGrid>
+      <w:tr>
+        <w:tc>
+          <w:tcPr>
+            <w:tcW w:type="dxa" w:w="9632"/>
+            <w:shd w:fill="EAF1FB"/>
+            <w:tcBorders>
+              <w:left w:val="single" w:sz="24" w:color="1F3864"/>
+            </w:tcBorders>
+          </w:tcPr>
+          <w:p>
+            <w:pPr>
+              <w:spacing w:before="80" w:after="80"/>
+            </w:pPr>
+            <w:r>
+              <w:rPr>
+                <w:rFonts w:ascii="Calibri" w:hAnsi="Calibri"/>
+              </w:rPr>
+            </w:r>
+            <w:r>
+              <w:rPr>
+                <w:rFonts w:ascii="Calibri" w:hAnsi="Calibri"/>
+                <w:b/>
+                <w:color w:val="2E74B5"/>
+                <w:sz w:val="16"/>
+              </w:rPr>
+              <w:t>À SAVOIR AVANT DE LIRE</w:t>
+              <w:br/>
+            </w:r>
+            <w:r>
+              <w:rPr>
+                <w:rFonts w:ascii="Calibri" w:hAnsi="Calibri"/>
+                <w:color w:val="1F3864"/>
+                <w:sz w:val="20"/>
+              </w:rPr>
+              <w:t>Le guide de l'ANSSI est volontairement partiel : il ne détaille qu'un seul scénario opérationnel sur cinq, et rien sur l'ISO 27001. Plus de la moitié de ce document est donc un travail original, construit sur ce que le guide laisse ouvert — pas une reformulation de ce que l'ANSSI a écrit. Le détail complet, ligne par ligne, est dans CREDITS.md du dépôt GitHub du projet.</w:t>
+            </w:r>
+          </w:p>
+        </w:tc>
+      </w:tr>
+    </w:tbl>
+    <w:p>
+      <w:pPr>
+        <w:spacing w:after="40"/>
+      </w:pPr>
     </w:p>
     <w:p>
       <w:pPr>

</xml_diff>